<commit_message>
docs: update documentation pre final sustentation
</commit_message>
<xml_diff>
--- a/docs/T6/manual_tecnico/Manual_Tecnico_HealthConnection.docx
+++ b/docs/T6/manual_tecnico/Manual_Tecnico_HealthConnection.docx
@@ -40,30 +40,8 @@
         <w:rPr>
           <w:lang w:val="es-CO"/>
         </w:rPr>
-        <w:t xml:space="preserve">Nombre del proyecto: </w:t>
+        <w:t>Nombre del proyecto: Health Connection</w:t>
       </w:r>
-      <w:proofErr w:type="spellStart"/>
-      <w:r>
-        <w:rPr>
-          <w:lang w:val="es-CO"/>
-        </w:rPr>
-        <w:t>Health</w:t>
-      </w:r>
-      <w:proofErr w:type="spellEnd"/>
-      <w:r>
-        <w:rPr>
-          <w:lang w:val="es-CO"/>
-        </w:rPr>
-        <w:t xml:space="preserve"> </w:t>
-      </w:r>
-      <w:proofErr w:type="spellStart"/>
-      <w:r>
-        <w:rPr>
-          <w:lang w:val="es-CO"/>
-        </w:rPr>
-        <w:t>Connection</w:t>
-      </w:r>
-      <w:proofErr w:type="spellEnd"/>
       <w:r>
         <w:rPr>
           <w:lang w:val="es-CO"/>
@@ -90,6 +68,11 @@
           <w:lang w:val="es-CO"/>
         </w:rPr>
         <w:br/>
+      </w:r>
+      <w:r>
+        <w:rPr>
+          <w:lang w:val="es-CO"/>
+        </w:rPr>
         <w:t>Institución: SENA 2025</w:t>
       </w:r>
       <w:r>
@@ -109,35 +92,7 @@
         <w:rPr>
           <w:lang w:val="es-CO"/>
         </w:rPr>
-        <w:t xml:space="preserve">Derechos de autor: Este documento es propiedad del equipo de desarrollo de </w:t>
-      </w:r>
-      <w:proofErr w:type="spellStart"/>
-      <w:r>
-        <w:rPr>
-          <w:lang w:val="es-CO"/>
-        </w:rPr>
-        <w:t>Health</w:t>
-      </w:r>
-      <w:proofErr w:type="spellEnd"/>
-      <w:r>
-        <w:rPr>
-          <w:lang w:val="es-CO"/>
-        </w:rPr>
-        <w:t xml:space="preserve"> </w:t>
-      </w:r>
-      <w:proofErr w:type="spellStart"/>
-      <w:r>
-        <w:rPr>
-          <w:lang w:val="es-CO"/>
-        </w:rPr>
-        <w:t>Connection</w:t>
-      </w:r>
-      <w:proofErr w:type="spellEnd"/>
-      <w:r>
-        <w:rPr>
-          <w:lang w:val="es-CO"/>
-        </w:rPr>
-        <w:t>. Su reproducción está sujeta a autorización expresa.</w:t>
+        <w:t>Derechos de autor: Este documento es propiedad del equipo de desarrollo de Health Connection. Su reproducción está sujeta a autorización expresa.</w:t>
       </w:r>
     </w:p>
     <w:p>
@@ -245,70 +200,26 @@
         <w:rPr>
           <w:lang w:val="es-CO"/>
         </w:rPr>
-        <w:t xml:space="preserve">El sistema está basado en una arquitectura limpia de cuatro capas: Entidades, Casos de uso, Interfaces, y </w:t>
-      </w:r>
-      <w:proofErr w:type="spellStart"/>
-      <w:r>
-        <w:rPr>
-          <w:lang w:val="es-CO"/>
-        </w:rPr>
-        <w:t>Frameworks</w:t>
-      </w:r>
-      <w:proofErr w:type="spellEnd"/>
-      <w:r>
-        <w:rPr>
-          <w:lang w:val="es-CO"/>
-        </w:rPr>
-        <w:t>/Drivers.</w:t>
+        <w:t>El sistema está basado en una arquitectura limpia de cuatro capas: Entidades, Casos de uso, Interfaces, y Frameworks/Drivers.</w:t>
       </w:r>
       <w:r>
         <w:rPr>
           <w:lang w:val="es-CO"/>
         </w:rPr>
         <w:br/>
-        <w:t xml:space="preserve">Tecnologías: Node.js 22.7.0, Express 4+, </w:t>
+        <w:t>Tecnologías: Node.js 22.7.0, Express 4+, React 18.3.1, PostgreSQL (</w:t>
       </w:r>
-      <w:proofErr w:type="spellStart"/>
       <w:r>
         <w:rPr>
           <w:lang w:val="es-CO"/>
         </w:rPr>
-        <w:t>React</w:t>
+        <w:t>16</w:t>
       </w:r>
-      <w:proofErr w:type="spellEnd"/>
       <w:r>
         <w:rPr>
           <w:lang w:val="es-CO"/>
         </w:rPr>
-        <w:t xml:space="preserve"> 18.3.1, PostgreSQL (</w:t>
-      </w:r>
-      <w:proofErr w:type="spellStart"/>
-      <w:r>
-        <w:rPr>
-          <w:lang w:val="es-CO"/>
-        </w:rPr>
-        <w:t>latest</w:t>
-      </w:r>
-      <w:proofErr w:type="spellEnd"/>
-      <w:r>
-        <w:rPr>
-          <w:lang w:val="es-CO"/>
-        </w:rPr>
-        <w:t xml:space="preserve">), </w:t>
-      </w:r>
-      <w:proofErr w:type="spellStart"/>
-      <w:r>
-        <w:rPr>
-          <w:lang w:val="es-CO"/>
-        </w:rPr>
-        <w:t>Sequelize</w:t>
-      </w:r>
-      <w:proofErr w:type="spellEnd"/>
-      <w:r>
-        <w:rPr>
-          <w:lang w:val="es-CO"/>
-        </w:rPr>
-        <w:t>, Vite 6.0.1.</w:t>
+        <w:t>), Sequelize, Vite 6.0.1.</w:t>
       </w:r>
       <w:r>
         <w:rPr>
@@ -326,28 +237,169 @@
     </w:p>
     <w:p>
       <w:pPr>
+        <w:pStyle w:val="Ttulo2"/>
         <w:rPr>
           <w:lang w:val="es-CO"/>
         </w:rPr>
       </w:pPr>
-      <w:proofErr w:type="gramStart"/>
       <w:r>
         <w:rPr>
           <w:lang w:val="es-CO"/>
         </w:rPr>
-        <w:t>Diagramas a incluir</w:t>
-      </w:r>
-      <w:proofErr w:type="gramEnd"/>
-      <w:r>
-        <w:rPr>
-          <w:lang w:val="es-CO"/>
-        </w:rPr>
-        <w:t>: arquitectura, despliegue, clases.</w:t>
+        <w:lastRenderedPageBreak/>
+        <w:t>- Diagrama de arquitectura</w:t>
       </w:r>
     </w:p>
     <w:p>
       <w:pPr>
-        <w:pStyle w:val="Ttulo1"/>
+        <w:rPr>
+          <w:lang w:val="es-CO"/>
+        </w:rPr>
+      </w:pPr>
+      <w:r>
+        <w:rPr>
+          <w:lang w:val="es-CO"/>
+        </w:rPr>
+        <w:drawing>
+          <wp:inline distT="0" distB="0" distL="0" distR="0" wp14:anchorId="513FF298" wp14:editId="747707D2">
+            <wp:extent cx="5486400" cy="3865880"/>
+            <wp:effectExtent l="0" t="0" r="0" b="1270"/>
+            <wp:docPr id="854568280" name="Imagen 1"/>
+            <wp:cNvGraphicFramePr>
+              <a:graphicFrameLocks xmlns:a="http://schemas.openxmlformats.org/drawingml/2006/main" noChangeAspect="1"/>
+            </wp:cNvGraphicFramePr>
+            <a:graphic xmlns:a="http://schemas.openxmlformats.org/drawingml/2006/main">
+              <a:graphicData uri="http://schemas.openxmlformats.org/drawingml/2006/picture">
+                <pic:pic xmlns:pic="http://schemas.openxmlformats.org/drawingml/2006/picture">
+                  <pic:nvPicPr>
+                    <pic:cNvPr id="854568280" name=""/>
+                    <pic:cNvPicPr/>
+                  </pic:nvPicPr>
+                  <pic:blipFill>
+                    <a:blip r:embed="rId6"/>
+                    <a:stretch>
+                      <a:fillRect/>
+                    </a:stretch>
+                  </pic:blipFill>
+                  <pic:spPr>
+                    <a:xfrm>
+                      <a:off x="0" y="0"/>
+                      <a:ext cx="5486400" cy="3865880"/>
+                    </a:xfrm>
+                    <a:prstGeom prst="rect">
+                      <a:avLst/>
+                    </a:prstGeom>
+                  </pic:spPr>
+                </pic:pic>
+              </a:graphicData>
+            </a:graphic>
+          </wp:inline>
+        </w:drawing>
+      </w:r>
+    </w:p>
+    <w:p>
+      <w:pPr>
+        <w:pStyle w:val="Ttulo2"/>
+        <w:rPr>
+          <w:lang w:val="es-CO"/>
+        </w:rPr>
+      </w:pPr>
+      <w:r>
+        <w:rPr>
+          <w:lang w:val="es-CO"/>
+        </w:rPr>
+        <w:t>- Diagrama de clases</w:t>
+      </w:r>
+    </w:p>
+    <w:p>
+      <w:pPr>
+        <w:rPr>
+          <w:lang w:val="es-CO"/>
+        </w:rPr>
+      </w:pPr>
+      <w:hyperlink r:id="rId7" w:history="1">
+        <w:proofErr w:type="gramStart"/>
+        <w:r>
+          <w:rPr>
+            <w:rStyle w:val="Hipervnculo"/>
+            <w:lang w:val="es-CO"/>
+          </w:rPr>
+          <w:t>..</w:t>
+        </w:r>
+        <w:proofErr w:type="gramEnd"/>
+        <w:r>
+          <w:rPr>
+            <w:rStyle w:val="Hipervnculo"/>
+            <w:lang w:val="es-CO"/>
+          </w:rPr>
+          <w:t>\..\T2\diagrama_clases\Diagrama de clases HealthConnection.pdf</w:t>
+        </w:r>
+      </w:hyperlink>
+    </w:p>
+    <w:p>
+      <w:pPr>
+        <w:pStyle w:val="Ttulo2"/>
+        <w:rPr>
+          <w:lang w:val="es-CO"/>
+        </w:rPr>
+      </w:pPr>
+      <w:r>
+        <w:rPr>
+          <w:lang w:val="es-CO"/>
+        </w:rPr>
+        <w:t>- Diagrama de despliegue</w:t>
+      </w:r>
+    </w:p>
+    <w:p>
+      <w:pPr>
+        <w:rPr>
+          <w:lang w:val="es-CO"/>
+        </w:rPr>
+      </w:pPr>
+      <w:r>
+        <w:rPr>
+          <w:lang w:val="es-CO"/>
+        </w:rPr>
+        <w:drawing>
+          <wp:inline distT="0" distB="0" distL="0" distR="0" wp14:anchorId="105F4C33" wp14:editId="38E0F33C">
+            <wp:extent cx="5486400" cy="3011805"/>
+            <wp:effectExtent l="0" t="0" r="0" b="0"/>
+            <wp:docPr id="20671332" name="Imagen 1"/>
+            <wp:cNvGraphicFramePr>
+              <a:graphicFrameLocks xmlns:a="http://schemas.openxmlformats.org/drawingml/2006/main" noChangeAspect="1"/>
+            </wp:cNvGraphicFramePr>
+            <a:graphic xmlns:a="http://schemas.openxmlformats.org/drawingml/2006/main">
+              <a:graphicData uri="http://schemas.openxmlformats.org/drawingml/2006/picture">
+                <pic:pic xmlns:pic="http://schemas.openxmlformats.org/drawingml/2006/picture">
+                  <pic:nvPicPr>
+                    <pic:cNvPr id="20671332" name=""/>
+                    <pic:cNvPicPr/>
+                  </pic:nvPicPr>
+                  <pic:blipFill>
+                    <a:blip r:embed="rId8"/>
+                    <a:stretch>
+                      <a:fillRect/>
+                    </a:stretch>
+                  </pic:blipFill>
+                  <pic:spPr>
+                    <a:xfrm>
+                      <a:off x="0" y="0"/>
+                      <a:ext cx="5486400" cy="3011805"/>
+                    </a:xfrm>
+                    <a:prstGeom prst="rect">
+                      <a:avLst/>
+                    </a:prstGeom>
+                  </pic:spPr>
+                </pic:pic>
+              </a:graphicData>
+            </a:graphic>
+          </wp:inline>
+        </w:drawing>
+      </w:r>
+    </w:p>
+    <w:p>
+      <w:pPr>
+        <w:pStyle w:val="Ttulo2"/>
         <w:rPr>
           <w:lang w:val="es-CO"/>
         </w:rPr>
@@ -427,14 +479,12 @@
         <w:br/>
         <w:t>- PostgreSQL (</w:t>
       </w:r>
-      <w:proofErr w:type="spellStart"/>
       <w:r>
         <w:rPr>
           <w:lang w:val="es-CO"/>
         </w:rPr>
-        <w:t>latest</w:t>
+        <w:t>16</w:t>
       </w:r>
-      <w:proofErr w:type="spellEnd"/>
       <w:r>
         <w:rPr>
           <w:lang w:val="es-CO"/>
@@ -466,21 +516,7 @@
           <w:lang w:val="es-CO"/>
         </w:rPr>
         <w:br/>
-        <w:t>Variables de entorno comunes (.</w:t>
-      </w:r>
-      <w:proofErr w:type="spellStart"/>
-      <w:r>
-        <w:rPr>
-          <w:lang w:val="es-CO"/>
-        </w:rPr>
-        <w:t>env</w:t>
-      </w:r>
-      <w:proofErr w:type="spellEnd"/>
-      <w:r>
-        <w:rPr>
-          <w:lang w:val="es-CO"/>
-        </w:rPr>
-        <w:t>):</w:t>
+        <w:t>Variables de entorno comunes (.env):</w:t>
       </w:r>
       <w:r>
         <w:rPr>
@@ -520,21 +556,7 @@
         <w:rPr>
           <w:lang w:val="es-CO"/>
         </w:rPr>
-        <w:t xml:space="preserve">El proyecto está organizado como un </w:t>
-      </w:r>
-      <w:proofErr w:type="spellStart"/>
-      <w:r>
-        <w:rPr>
-          <w:lang w:val="es-CO"/>
-        </w:rPr>
-        <w:t>monorepo</w:t>
-      </w:r>
-      <w:proofErr w:type="spellEnd"/>
-      <w:r>
-        <w:rPr>
-          <w:lang w:val="es-CO"/>
-        </w:rPr>
-        <w:t xml:space="preserve"> con la siguiente estructura de carpetas:</w:t>
+        <w:t>El proyecto está organizado como un monorepo con la siguiente estructura de carpetas:</w:t>
       </w:r>
     </w:p>
     <w:p>
@@ -577,23 +599,11 @@
       </w:pPr>
       <w:r>
         <w:rPr>
-          <w:lang w:val="es-CO"/>
-        </w:rPr>
-        <w:t xml:space="preserve">**Instalación </w:t>
-      </w:r>
-      <w:proofErr w:type="gramStart"/>
-      <w:r>
-        <w:rPr>
-          <w:lang w:val="es-CO"/>
-        </w:rPr>
-        <w:t>local:*</w:t>
-      </w:r>
-      <w:proofErr w:type="gramEnd"/>
-      <w:r>
-        <w:rPr>
-          <w:lang w:val="es-CO"/>
-        </w:rPr>
-        <w:t>*</w:t>
+          <w:b/>
+          <w:bCs/>
+          <w:lang w:val="es-CO"/>
+        </w:rPr>
+        <w:t>Instalación local:</w:t>
       </w:r>
       <w:r>
         <w:rPr>
@@ -607,29 +617,7 @@
           <w:lang w:val="es-CO"/>
         </w:rPr>
         <w:br/>
-        <w:t xml:space="preserve">2. Crear archivos </w:t>
-      </w:r>
-      <w:proofErr w:type="gramStart"/>
-      <w:r>
-        <w:rPr>
-          <w:lang w:val="es-CO"/>
-        </w:rPr>
-        <w:t>`.</w:t>
-      </w:r>
-      <w:proofErr w:type="spellStart"/>
-      <w:r>
-        <w:rPr>
-          <w:lang w:val="es-CO"/>
-        </w:rPr>
-        <w:t>env</w:t>
-      </w:r>
-      <w:proofErr w:type="spellEnd"/>
-      <w:proofErr w:type="gramEnd"/>
-      <w:r>
-        <w:rPr>
-          <w:lang w:val="es-CO"/>
-        </w:rPr>
-        <w:t>`</w:t>
+        <w:t>2. Crear archivos `.env`</w:t>
       </w:r>
       <w:r>
         <w:rPr>
@@ -650,78 +638,14 @@
           <w:lang w:val="es-CO"/>
         </w:rPr>
         <w:br/>
-        <w:t xml:space="preserve">5. Ejecutar migraciones y </w:t>
-      </w:r>
-      <w:proofErr w:type="spellStart"/>
-      <w:r>
-        <w:rPr>
-          <w:lang w:val="es-CO"/>
-        </w:rPr>
-        <w:t>seeders</w:t>
-      </w:r>
-      <w:proofErr w:type="spellEnd"/>
-      <w:r>
-        <w:rPr>
-          <w:lang w:val="es-CO"/>
-        </w:rPr>
-        <w:br/>
-        <w:t xml:space="preserve">6. Levantar servidor backend y </w:t>
-      </w:r>
-      <w:proofErr w:type="spellStart"/>
-      <w:r>
-        <w:rPr>
-          <w:lang w:val="es-CO"/>
-        </w:rPr>
-        <w:t>frontend</w:t>
-      </w:r>
-      <w:proofErr w:type="spellEnd"/>
-    </w:p>
-    <w:p>
-      <w:pPr>
-        <w:rPr>
-          <w:lang w:val="es-CO"/>
-        </w:rPr>
-      </w:pPr>
-      <w:r>
-        <w:rPr>
-          <w:lang w:val="es-CO"/>
-        </w:rPr>
-        <w:t xml:space="preserve">**Instalación con </w:t>
-      </w:r>
-      <w:proofErr w:type="gramStart"/>
-      <w:r>
-        <w:rPr>
-          <w:lang w:val="es-CO"/>
-        </w:rPr>
-        <w:t>Docker:*</w:t>
-      </w:r>
-      <w:proofErr w:type="gramEnd"/>
-      <w:r>
-        <w:rPr>
-          <w:lang w:val="es-CO"/>
-        </w:rPr>
-        <w:t>*</w:t>
+        <w:t>5. Ejecutar migraciones y seeders</w:t>
       </w:r>
       <w:r>
         <w:rPr>
           <w:lang w:val="es-CO"/>
         </w:rPr>
         <w:br/>
-        <w:t xml:space="preserve">Opcional si se desea </w:t>
-      </w:r>
-      <w:proofErr w:type="spellStart"/>
-      <w:r>
-        <w:rPr>
-          <w:lang w:val="es-CO"/>
-        </w:rPr>
-        <w:t>contenerizar</w:t>
-      </w:r>
-      <w:proofErr w:type="spellEnd"/>
-      <w:r>
-        <w:rPr>
-          <w:lang w:val="es-CO"/>
-        </w:rPr>
-        <w:t xml:space="preserve"> todo el sistema.</w:t>
+        <w:t>6. Levantar servidor backend y frontend</w:t>
       </w:r>
     </w:p>
     <w:p>
@@ -732,80 +656,59 @@
       </w:pPr>
       <w:r>
         <w:rPr>
-          <w:lang w:val="es-CO"/>
-        </w:rPr>
-        <w:t>**Despliegue en producción (</w:t>
-      </w:r>
-      <w:proofErr w:type="spellStart"/>
-      <w:r>
-        <w:rPr>
-          <w:lang w:val="es-CO"/>
-        </w:rPr>
-        <w:t>Railway</w:t>
-      </w:r>
-      <w:proofErr w:type="spellEnd"/>
-      <w:proofErr w:type="gramStart"/>
-      <w:r>
-        <w:rPr>
-          <w:lang w:val="es-CO"/>
-        </w:rPr>
-        <w:t>):*</w:t>
-      </w:r>
-      <w:proofErr w:type="gramEnd"/>
-      <w:r>
-        <w:rPr>
-          <w:lang w:val="es-CO"/>
-        </w:rPr>
-        <w:t>*</w:t>
+          <w:b/>
+          <w:bCs/>
+          <w:lang w:val="es-CO"/>
+        </w:rPr>
+        <w:t>Instalación con Docker:</w:t>
       </w:r>
       <w:r>
         <w:rPr>
           <w:lang w:val="es-CO"/>
         </w:rPr>
         <w:br/>
-        <w:t xml:space="preserve">Crear servicios por separado para backend, </w:t>
+        <w:t>Opcional si se desea contenerizar todo el sistema.</w:t>
       </w:r>
-      <w:proofErr w:type="spellStart"/>
+    </w:p>
+    <w:p>
+      <w:pPr>
+        <w:rPr>
+          <w:lang w:val="es-CO"/>
+        </w:rPr>
+      </w:pPr>
       <w:r>
         <w:rPr>
-          <w:lang w:val="es-CO"/>
-        </w:rPr>
-        <w:t>frontend</w:t>
+          <w:b/>
+          <w:bCs/>
+          <w:lang w:val="es-CO"/>
+        </w:rPr>
+        <w:t>Despliegue en producción (Railway):</w:t>
       </w:r>
-      <w:proofErr w:type="spellEnd"/>
       <w:r>
         <w:rPr>
           <w:lang w:val="es-CO"/>
         </w:rPr>
-        <w:t xml:space="preserve"> y base de datos. Configurar variables y </w:t>
+        <w:br/>
       </w:r>
-      <w:proofErr w:type="spellStart"/>
       <w:r>
         <w:rPr>
           <w:lang w:val="es-CO"/>
         </w:rPr>
-        <w:t>root</w:t>
+        <w:t>Crear servicios por separado para backend, frontend y base de datos. Configurar variables y root directories. Ejecutar migraciones y seeders con comandos personalizados.</w:t>
       </w:r>
-      <w:proofErr w:type="spellEnd"/>
+    </w:p>
+    <w:p>
+      <w:pPr>
+        <w:rPr>
+          <w:lang w:val="es-CO"/>
+        </w:rPr>
+      </w:pPr>
       <w:r>
         <w:rPr>
           <w:lang w:val="es-CO"/>
         </w:rPr>
-        <w:t xml:space="preserve"> directories. Ejecutar migraciones y </w:t>
-      </w:r>
-      <w:proofErr w:type="spellStart"/>
-      <w:r>
-        <w:rPr>
-          <w:lang w:val="es-CO"/>
-        </w:rPr>
-        <w:t>seeders</w:t>
-      </w:r>
-      <w:proofErr w:type="spellEnd"/>
-      <w:r>
-        <w:rPr>
-          <w:lang w:val="es-CO"/>
-        </w:rPr>
-        <w:t xml:space="preserve"> con comandos personalizados.</w:t>
+        <w:lastRenderedPageBreak/>
+        <w:t>Proceso completo y a profundidad en el anexo 5</w:t>
       </w:r>
     </w:p>
     <w:p>
@@ -819,7 +722,6 @@
         <w:rPr>
           <w:lang w:val="es-CO"/>
         </w:rPr>
-        <w:lastRenderedPageBreak/>
         <w:t>9. FUNCIONALIDADES DEL SISTEMA</w:t>
       </w:r>
     </w:p>
@@ -894,7 +796,110 @@
         <w:rPr>
           <w:lang w:val="es-CO"/>
         </w:rPr>
-        <w:t>Incluir aquí el modelo entidad-relación (ER) y el diccionario de datos con campos, tipos y relaciones.</w:t>
+        <w:t xml:space="preserve">- </w:t>
+      </w:r>
+      <w:hyperlink r:id="rId9" w:history="1">
+        <w:r>
+          <w:rPr>
+            <w:rStyle w:val="Hipervnculo"/>
+            <w:lang w:val="es-CO"/>
+          </w:rPr>
+          <w:t>Diccionario d</w:t>
+        </w:r>
+        <w:r>
+          <w:rPr>
+            <w:rStyle w:val="Hipervnculo"/>
+            <w:lang w:val="es-CO"/>
+          </w:rPr>
+          <w:t>e</w:t>
+        </w:r>
+        <w:r>
+          <w:rPr>
+            <w:rStyle w:val="Hipervnculo"/>
+            <w:lang w:val="es-CO"/>
+          </w:rPr>
+          <w:t xml:space="preserve"> datos</w:t>
+        </w:r>
+      </w:hyperlink>
+    </w:p>
+    <w:p>
+      <w:pPr>
+        <w:pStyle w:val="Ttulo1"/>
+        <w:rPr>
+          <w:lang w:val="es-CO"/>
+        </w:rPr>
+      </w:pPr>
+      <w:r>
+        <w:rPr>
+          <w:lang w:val="es-CO"/>
+        </w:rPr>
+        <w:t>11. PRUEBAS</w:t>
+      </w:r>
+    </w:p>
+    <w:p>
+      <w:pPr>
+        <w:rPr>
+          <w:lang w:val="es-CO"/>
+        </w:rPr>
+      </w:pPr>
+      <w:r>
+        <w:rPr>
+          <w:lang w:val="es-CO"/>
+        </w:rPr>
+        <w:t>Tipos de pruebas realizadas:</w:t>
+      </w:r>
+      <w:r>
+        <w:rPr>
+          <w:lang w:val="es-CO"/>
+        </w:rPr>
+        <w:br/>
+        <w:t>- Pruebas unitarias: Jest</w:t>
+      </w:r>
+      <w:r>
+        <w:rPr>
+          <w:lang w:val="es-CO"/>
+        </w:rPr>
+        <w:br/>
+        <w:t>- Cobertura: disponible en carpeta /coverage</w:t>
+      </w:r>
+      <w:r>
+        <w:rPr>
+          <w:lang w:val="es-CO"/>
+        </w:rPr>
+        <w:br/>
+      </w:r>
+      <w:r>
+        <w:rPr>
+          <w:lang w:val="es-CO"/>
+        </w:rPr>
+        <w:br/>
+        <w:t>Comando de pruebas:</w:t>
+      </w:r>
+      <w:r>
+        <w:rPr>
+          <w:lang w:val="es-CO"/>
+        </w:rPr>
+        <w:br/>
+        <w:t>npm run test</w:t>
+      </w:r>
+      <w:r>
+        <w:rPr>
+          <w:lang w:val="es-CO"/>
+        </w:rPr>
+        <w:br/>
+      </w:r>
+    </w:p>
+    <w:p>
+      <w:pPr>
+        <w:rPr>
+          <w:lang w:val="es-CO"/>
+        </w:rPr>
+      </w:pPr>
+      <w:r>
+        <w:rPr>
+          <w:lang w:val="es-CO"/>
+        </w:rPr>
+        <w:t>Proceso y conclusiones en el anexo 2</w:t>
       </w:r>
     </w:p>
     <w:p>
@@ -908,7 +913,19 @@
         <w:rPr>
           <w:lang w:val="es-CO"/>
         </w:rPr>
-        <w:t>11. PRUEBAS</w:t>
+        <w:t>1</w:t>
+      </w:r>
+      <w:r>
+        <w:rPr>
+          <w:lang w:val="es-CO"/>
+        </w:rPr>
+        <w:t>2</w:t>
+      </w:r>
+      <w:r>
+        <w:rPr>
+          <w:lang w:val="es-CO"/>
+        </w:rPr>
+        <w:t>. ANEXOS</w:t>
       </w:r>
     </w:p>
     <w:p>
@@ -921,68 +938,20 @@
         <w:rPr>
           <w:lang w:val="es-CO"/>
         </w:rPr>
-        <w:t>Tipos de pruebas realizadas:</w:t>
+        <w:t xml:space="preserve">1. </w:t>
       </w:r>
-      <w:r>
-        <w:rPr>
-          <w:lang w:val="es-CO"/>
-        </w:rPr>
-        <w:br/>
-        <w:t xml:space="preserve">- Pruebas unitarias: </w:t>
-      </w:r>
-      <w:proofErr w:type="spellStart"/>
-      <w:r>
-        <w:rPr>
-          <w:lang w:val="es-CO"/>
-        </w:rPr>
-        <w:t>Jest</w:t>
-      </w:r>
-      <w:proofErr w:type="spellEnd"/>
-      <w:r>
-        <w:rPr>
-          <w:lang w:val="es-CO"/>
-        </w:rPr>
-        <w:br/>
-        <w:t>- Cobertura: disponible en carpeta /</w:t>
-      </w:r>
-      <w:proofErr w:type="spellStart"/>
-      <w:r>
-        <w:rPr>
-          <w:lang w:val="es-CO"/>
-        </w:rPr>
-        <w:t>coverage</w:t>
-      </w:r>
-      <w:proofErr w:type="spellEnd"/>
-      <w:r>
-        <w:rPr>
-          <w:lang w:val="es-CO"/>
-        </w:rPr>
-        <w:br/>
-      </w:r>
-      <w:r>
-        <w:rPr>
-          <w:lang w:val="es-CO"/>
-        </w:rPr>
-        <w:br/>
-        <w:t>Comando de pruebas:</w:t>
-      </w:r>
-      <w:r>
-        <w:rPr>
-          <w:lang w:val="es-CO"/>
-        </w:rPr>
-        <w:br/>
-        <w:t>npm run test</w:t>
-      </w:r>
-      <w:r>
-        <w:rPr>
-          <w:lang w:val="es-CO"/>
-        </w:rPr>
-        <w:br/>
-      </w:r>
+      <w:hyperlink r:id="rId10" w:history="1">
+        <w:r>
+          <w:rPr>
+            <w:rStyle w:val="Hipervnculo"/>
+            <w:lang w:val="es-CO"/>
+          </w:rPr>
+          <w:t>plan instalación</w:t>
+        </w:r>
+      </w:hyperlink>
     </w:p>
     <w:p>
       <w:pPr>
-        <w:pStyle w:val="Ttulo1"/>
         <w:rPr>
           <w:lang w:val="es-CO"/>
         </w:rPr>
@@ -991,8 +960,17 @@
         <w:rPr>
           <w:lang w:val="es-CO"/>
         </w:rPr>
-        <w:t>12. INTEGRACIONES EXTERNAS</w:t>
+        <w:t xml:space="preserve">2. </w:t>
       </w:r>
+      <w:hyperlink r:id="rId11" w:history="1">
+        <w:r>
+          <w:rPr>
+            <w:rStyle w:val="Hipervnculo"/>
+            <w:lang w:val="es-CO"/>
+          </w:rPr>
+          <w:t>plan pruebas</w:t>
+        </w:r>
+      </w:hyperlink>
     </w:p>
     <w:p>
       <w:pPr>
@@ -1004,26 +982,20 @@
         <w:rPr>
           <w:lang w:val="es-CO"/>
         </w:rPr>
-        <w:t xml:space="preserve">- </w:t>
+        <w:t xml:space="preserve">3. </w:t>
       </w:r>
-      <w:proofErr w:type="spellStart"/>
-      <w:r>
-        <w:rPr>
-          <w:lang w:val="es-CO"/>
-        </w:rPr>
-        <w:t>Nodemailer</w:t>
-      </w:r>
-      <w:proofErr w:type="spellEnd"/>
-      <w:r>
-        <w:rPr>
-          <w:lang w:val="es-CO"/>
-        </w:rPr>
-        <w:t xml:space="preserve"> para envío de correos (SMTP)</w:t>
-      </w:r>
+      <w:hyperlink r:id="rId12" w:history="1">
+        <w:r>
+          <w:rPr>
+            <w:rStyle w:val="Hipervnculo"/>
+            <w:lang w:val="es-CO"/>
+          </w:rPr>
+          <w:t>plan migración</w:t>
+        </w:r>
+      </w:hyperlink>
     </w:p>
     <w:p>
       <w:pPr>
-        <w:pStyle w:val="Ttulo1"/>
         <w:rPr>
           <w:lang w:val="es-CO"/>
         </w:rPr>
@@ -1032,8 +1004,17 @@
         <w:rPr>
           <w:lang w:val="es-CO"/>
         </w:rPr>
-        <w:t>13. ANEXOS</w:t>
+        <w:t xml:space="preserve">4. </w:t>
       </w:r>
+      <w:hyperlink r:id="rId13" w:history="1">
+        <w:r>
+          <w:rPr>
+            <w:rStyle w:val="Hipervnculo"/>
+            <w:lang w:val="es-CO"/>
+          </w:rPr>
+          <w:t>plan respaldo</w:t>
+        </w:r>
+      </w:hyperlink>
     </w:p>
     <w:p>
       <w:pPr>
@@ -1045,8 +1026,61 @@
         <w:rPr>
           <w:lang w:val="es-CO"/>
         </w:rPr>
-        <w:t>Enlaces a APIs utilizadas, diagramas, documentación técnica adicional.</w:t>
+        <w:t xml:space="preserve">5. </w:t>
       </w:r>
+      <w:hyperlink r:id="rId14" w:history="1">
+        <w:r>
+          <w:rPr>
+            <w:rStyle w:val="Hipervnculo"/>
+            <w:lang w:val="es-CO"/>
+          </w:rPr>
+          <w:t>manual instalación</w:t>
+        </w:r>
+      </w:hyperlink>
+    </w:p>
+    <w:p>
+      <w:pPr>
+        <w:rPr>
+          <w:lang w:val="es-CO"/>
+        </w:rPr>
+      </w:pPr>
+      <w:r>
+        <w:rPr>
+          <w:lang w:val="es-CO"/>
+        </w:rPr>
+        <w:t xml:space="preserve">6. </w:t>
+      </w:r>
+      <w:hyperlink r:id="rId15" w:history="1">
+        <w:r>
+          <w:rPr>
+            <w:rStyle w:val="Hipervnculo"/>
+            <w:lang w:val="es-CO"/>
+          </w:rPr>
+          <w:t>manual usuario</w:t>
+        </w:r>
+      </w:hyperlink>
+    </w:p>
+    <w:p>
+      <w:pPr>
+        <w:rPr>
+          <w:lang w:val="es-CO"/>
+        </w:rPr>
+      </w:pPr>
+      <w:r>
+        <w:rPr>
+          <w:lang w:val="es-CO"/>
+        </w:rPr>
+        <w:t xml:space="preserve">7. </w:t>
+      </w:r>
+      <w:hyperlink r:id="rId16" w:history="1">
+        <w:r>
+          <w:rPr>
+            <w:rStyle w:val="Hipervnculo"/>
+            <w:lang w:val="es-CO"/>
+          </w:rPr>
+          <w:t>plan capacitación</w:t>
+        </w:r>
+      </w:hyperlink>
     </w:p>
     <w:sectPr>
       <w:pgSz w:w="12240" w:h="15840"/>
@@ -12644,6 +12678,41 @@
       </w:tcPr>
     </w:tblStylePr>
   </w:style>
+  <w:style w:type="character" w:styleId="Hipervnculo">
+    <w:name w:val="Hyperlink"/>
+    <w:basedOn w:val="Fuentedeprrafopredeter"/>
+    <w:uiPriority w:val="99"/>
+    <w:unhideWhenUsed/>
+    <w:rsid w:val="00797BC1"/>
+    <w:rPr>
+      <w:color w:val="0000FF" w:themeColor="hyperlink"/>
+      <w:u w:val="single"/>
+    </w:rPr>
+  </w:style>
+  <w:style w:type="character" w:styleId="Mencinsinresolver">
+    <w:name w:val="Unresolved Mention"/>
+    <w:basedOn w:val="Fuentedeprrafopredeter"/>
+    <w:uiPriority w:val="99"/>
+    <w:semiHidden/>
+    <w:unhideWhenUsed/>
+    <w:rsid w:val="00797BC1"/>
+    <w:rPr>
+      <w:color w:val="605E5C"/>
+      <w:shd w:val="clear" w:color="auto" w:fill="E1DFDD"/>
+    </w:rPr>
+  </w:style>
+  <w:style w:type="character" w:styleId="Hipervnculovisitado">
+    <w:name w:val="FollowedHyperlink"/>
+    <w:basedOn w:val="Fuentedeprrafopredeter"/>
+    <w:uiPriority w:val="99"/>
+    <w:semiHidden/>
+    <w:unhideWhenUsed/>
+    <w:rsid w:val="0078538A"/>
+    <w:rPr>
+      <w:color w:val="800080" w:themeColor="followedHyperlink"/>
+      <w:u w:val="single"/>
+    </w:rPr>
+  </w:style>
 </w:styles>
 </file>
 

</xml_diff>

<commit_message>
docs fix docs error
</commit_message>
<xml_diff>
--- a/docs/T6/manual_tecnico/Manual_Tecnico_HealthConnection.docx
+++ b/docs/T6/manual_tecnico/Manual_Tecnico_HealthConnection.docx
@@ -68,11 +68,6 @@
           <w:lang w:val="es-CO"/>
         </w:rPr>
         <w:br/>
-      </w:r>
-      <w:r>
-        <w:rPr>
-          <w:lang w:val="es-CO"/>
-        </w:rPr>
         <w:t>Institución: SENA 2025</w:t>
       </w:r>
       <w:r>
@@ -160,34 +155,13 @@
         <w:rPr>
           <w:lang w:val="es-CO"/>
         </w:rPr>
-        <w:t>4. GLOSARIO DE TÉRMINOS</w:t>
+        <w:t>4</w:t>
       </w:r>
-    </w:p>
-    <w:p>
-      <w:pPr>
-        <w:rPr>
-          <w:lang w:val="es-CO"/>
-        </w:rPr>
-      </w:pPr>
       <w:r>
         <w:rPr>
           <w:lang w:val="es-CO"/>
         </w:rPr>
-        <w:t>Agregar aquí términos técnicos utilizados en el sistema con su respectiva definición.</w:t>
-      </w:r>
-    </w:p>
-    <w:p>
-      <w:pPr>
-        <w:pStyle w:val="Ttulo1"/>
-        <w:rPr>
-          <w:lang w:val="es-CO"/>
-        </w:rPr>
-      </w:pPr>
-      <w:r>
-        <w:rPr>
-          <w:lang w:val="es-CO"/>
-        </w:rPr>
-        <w:t>5. ARQUITECTURA DEL SISTEMA</w:t>
+        <w:t>. ARQUITECTURA DEL SISTEMA</w:t>
       </w:r>
     </w:p>
     <w:p>
@@ -258,6 +232,7 @@
       </w:pPr>
       <w:r>
         <w:rPr>
+          <w:noProof/>
           <w:lang w:val="es-CO"/>
         </w:rPr>
         <w:drawing>
@@ -332,7 +307,23 @@
             <w:rStyle w:val="Hipervnculo"/>
             <w:lang w:val="es-CO"/>
           </w:rPr>
-          <w:t>\..\T2\diagrama_clases\Diagrama de clases HealthConnection.pdf</w:t>
+          <w:t>\..\T2\</w:t>
+        </w:r>
+        <w:proofErr w:type="spellStart"/>
+        <w:r>
+          <w:rPr>
+            <w:rStyle w:val="Hipervnculo"/>
+            <w:lang w:val="es-CO"/>
+          </w:rPr>
+          <w:t>diagrama_clases</w:t>
+        </w:r>
+        <w:proofErr w:type="spellEnd"/>
+        <w:r>
+          <w:rPr>
+            <w:rStyle w:val="Hipervnculo"/>
+            <w:lang w:val="es-CO"/>
+          </w:rPr>
+          <w:t>\Diagrama de clases HealthConnection.pdf</w:t>
         </w:r>
       </w:hyperlink>
     </w:p>
@@ -358,6 +349,7 @@
       </w:pPr>
       <w:r>
         <w:rPr>
+          <w:noProof/>
           <w:lang w:val="es-CO"/>
         </w:rPr>
         <w:drawing>
@@ -409,7 +401,13 @@
           <w:lang w:val="es-CO"/>
         </w:rPr>
         <w:lastRenderedPageBreak/>
-        <w:t>6. REQUISITOS TÉCNICOS</w:t>
+        <w:t>5</w:t>
+      </w:r>
+      <w:r>
+        <w:rPr>
+          <w:lang w:val="es-CO"/>
+        </w:rPr>
+        <w:t>. REQUISITOS TÉCNICOS</w:t>
       </w:r>
     </w:p>
     <w:p>
@@ -543,7 +541,13 @@
         <w:rPr>
           <w:lang w:val="es-CO"/>
         </w:rPr>
-        <w:t>7. ESTRUCTURA DEL PROYECTO</w:t>
+        <w:t>6</w:t>
+      </w:r>
+      <w:r>
+        <w:rPr>
+          <w:lang w:val="es-CO"/>
+        </w:rPr>
+        <w:t>. ESTRUCTURA DEL PROYECTO</w:t>
       </w:r>
     </w:p>
     <w:p>
@@ -588,7 +592,13 @@
         <w:rPr>
           <w:lang w:val="es-CO"/>
         </w:rPr>
-        <w:t>8. INSTALACIÓN Y DESPLIEGUE</w:t>
+        <w:t>7</w:t>
+      </w:r>
+      <w:r>
+        <w:rPr>
+          <w:lang w:val="es-CO"/>
+        </w:rPr>
+        <w:t>. INSTALACIÓN Y DESPLIEGUE</w:t>
       </w:r>
     </w:p>
     <w:p>
@@ -722,7 +732,13 @@
         <w:rPr>
           <w:lang w:val="es-CO"/>
         </w:rPr>
-        <w:t>9. FUNCIONALIDADES DEL SISTEMA</w:t>
+        <w:t>8</w:t>
+      </w:r>
+      <w:r>
+        <w:rPr>
+          <w:lang w:val="es-CO"/>
+        </w:rPr>
+        <w:t>. FUNCIONALIDADES DEL SISTEMA</w:t>
       </w:r>
     </w:p>
     <w:p>
@@ -783,7 +799,13 @@
         <w:rPr>
           <w:lang w:val="es-CO"/>
         </w:rPr>
-        <w:t>10. MODELO DE DATOS</w:t>
+        <w:t>9</w:t>
+      </w:r>
+      <w:r>
+        <w:rPr>
+          <w:lang w:val="es-CO"/>
+        </w:rPr>
+        <w:t>. MODELO DE DATOS</w:t>
       </w:r>
     </w:p>
     <w:p>
@@ -804,21 +826,7 @@
             <w:rStyle w:val="Hipervnculo"/>
             <w:lang w:val="es-CO"/>
           </w:rPr>
-          <w:t>Diccionario d</w:t>
-        </w:r>
-        <w:r>
-          <w:rPr>
-            <w:rStyle w:val="Hipervnculo"/>
-            <w:lang w:val="es-CO"/>
-          </w:rPr>
-          <w:t>e</w:t>
-        </w:r>
-        <w:r>
-          <w:rPr>
-            <w:rStyle w:val="Hipervnculo"/>
-            <w:lang w:val="es-CO"/>
-          </w:rPr>
-          <w:t xml:space="preserve"> datos</w:t>
+          <w:t>Diccionario de datos</w:t>
         </w:r>
       </w:hyperlink>
     </w:p>
@@ -833,7 +841,19 @@
         <w:rPr>
           <w:lang w:val="es-CO"/>
         </w:rPr>
-        <w:t>11. PRUEBAS</w:t>
+        <w:t>1</w:t>
+      </w:r>
+      <w:r>
+        <w:rPr>
+          <w:lang w:val="es-CO"/>
+        </w:rPr>
+        <w:t>0</w:t>
+      </w:r>
+      <w:r>
+        <w:rPr>
+          <w:lang w:val="es-CO"/>
+        </w:rPr>
+        <w:t>. PRUEBAS</w:t>
       </w:r>
     </w:p>
     <w:p>
@@ -919,7 +939,7 @@
         <w:rPr>
           <w:lang w:val="es-CO"/>
         </w:rPr>
-        <w:t>2</w:t>
+        <w:t>1</w:t>
       </w:r>
       <w:r>
         <w:rPr>

</xml_diff>